<commit_message>
Corregir orden de elementos XML en el Word del modelo de negocio
El archivo ahora pasa la validación de esquema de Office.

Co-Authored-By: Claude Fable 5.1 <noreply@anthropic.com>
Claude-Session: https://claude.ai/code/session_0139Ceoq2WEzfQEZHWt3qFaN
</commit_message>
<xml_diff>
--- a/modelo-negocio-penitenciario/Modelo_de_negocio_taller_CEVASEP_II_2026-2030.docx
+++ b/modelo-negocio-penitenciario/Modelo_de_negocio_taller_CEVASEP_II_2026-2030.docx
@@ -41,12 +41,12 @@
     </w:p>
     <w:p>
       <w:pPr>
-        <w:spacing w:before="120" w:after="160"/>
-        <w:ind w:left="340"/>
         <w:pBdr>
           <w:left w:val="single" w:sz="18" w:space="8" w:color="1F6F8B"/>
         </w:pBdr>
         <w:shd w:val="clear" w:color="auto" w:fill="F0F5F8"/>
+        <w:spacing w:before="120" w:after="160"/>
+        <w:ind w:left="340"/>
       </w:pPr>
       <w:r>
         <w:rPr>
@@ -161,13 +161,13 @@
         <w:tblW w:type="auto" w:w="0"/>
         <w:jc w:val="center"/>
         <w:tblLayout w:type="autofit"/>
-        <w:tblLook w:firstColumn="1" w:firstRow="1" w:lastColumn="0" w:lastRow="0" w:noHBand="0" w:noVBand="1" w:val="04A0"/>
         <w:tblCellMar>
           <w:top w:w="40" w:type="dxa"/>
           <w:left w:w="70" w:type="dxa"/>
           <w:bottom w:w="40" w:type="dxa"/>
           <w:right w:w="70" w:type="dxa"/>
         </w:tblCellMar>
+        <w:tblLook w:firstColumn="1" w:firstRow="1" w:lastColumn="0" w:lastRow="0" w:noHBand="0" w:noVBand="1" w:val="04A0"/>
       </w:tblPr>
       <w:tblGrid>
         <w:gridCol w:w="3324"/>
@@ -864,13 +864,13 @@
         <w:tblW w:type="auto" w:w="0"/>
         <w:jc w:val="center"/>
         <w:tblLayout w:type="autofit"/>
-        <w:tblLook w:firstColumn="1" w:firstRow="1" w:lastColumn="0" w:lastRow="0" w:noHBand="0" w:noVBand="1" w:val="04A0"/>
         <w:tblCellMar>
           <w:top w:w="40" w:type="dxa"/>
           <w:left w:w="70" w:type="dxa"/>
           <w:bottom w:w="40" w:type="dxa"/>
           <w:right w:w="70" w:type="dxa"/>
         </w:tblCellMar>
+        <w:tblLook w:firstColumn="1" w:firstRow="1" w:lastColumn="0" w:lastRow="0" w:noHBand="0" w:noVBand="1" w:val="04A0"/>
       </w:tblPr>
       <w:tblGrid>
         <w:gridCol w:w="3324"/>
@@ -1457,13 +1457,13 @@
         <w:tblW w:type="auto" w:w="0"/>
         <w:jc w:val="center"/>
         <w:tblLayout w:type="autofit"/>
-        <w:tblLook w:firstColumn="1" w:firstRow="1" w:lastColumn="0" w:lastRow="0" w:noHBand="0" w:noVBand="1" w:val="04A0"/>
         <w:tblCellMar>
           <w:top w:w="40" w:type="dxa"/>
           <w:left w:w="70" w:type="dxa"/>
           <w:bottom w:w="40" w:type="dxa"/>
           <w:right w:w="70" w:type="dxa"/>
         </w:tblCellMar>
+        <w:tblLook w:firstColumn="1" w:firstRow="1" w:lastColumn="0" w:lastRow="0" w:noHBand="0" w:noVBand="1" w:val="04A0"/>
       </w:tblPr>
       <w:tblGrid>
         <w:gridCol w:w="3324"/>
@@ -2033,13 +2033,13 @@
         <w:tblW w:type="auto" w:w="0"/>
         <w:jc w:val="center"/>
         <w:tblLayout w:type="autofit"/>
-        <w:tblLook w:firstColumn="1" w:firstRow="1" w:lastColumn="0" w:lastRow="0" w:noHBand="0" w:noVBand="1" w:val="04A0"/>
         <w:tblCellMar>
           <w:top w:w="40" w:type="dxa"/>
           <w:left w:w="70" w:type="dxa"/>
           <w:bottom w:w="40" w:type="dxa"/>
           <w:right w:w="70" w:type="dxa"/>
         </w:tblCellMar>
+        <w:tblLook w:firstColumn="1" w:firstRow="1" w:lastColumn="0" w:lastRow="0" w:noHBand="0" w:noVBand="1" w:val="04A0"/>
       </w:tblPr>
       <w:tblGrid>
         <w:gridCol w:w="4986"/>
@@ -3145,13 +3145,13 @@
         <w:tblW w:type="auto" w:w="0"/>
         <w:jc w:val="center"/>
         <w:tblLayout w:type="autofit"/>
-        <w:tblLook w:firstColumn="1" w:firstRow="1" w:lastColumn="0" w:lastRow="0" w:noHBand="0" w:noVBand="1" w:val="04A0"/>
         <w:tblCellMar>
           <w:top w:w="40" w:type="dxa"/>
           <w:left w:w="70" w:type="dxa"/>
           <w:bottom w:w="40" w:type="dxa"/>
           <w:right w:w="70" w:type="dxa"/>
         </w:tblCellMar>
+        <w:tblLook w:firstColumn="1" w:firstRow="1" w:lastColumn="0" w:lastRow="0" w:noHBand="0" w:noVBand="1" w:val="04A0"/>
       </w:tblPr>
       <w:tblGrid>
         <w:gridCol w:w="1425"/>
@@ -3893,13 +3893,13 @@
         <w:tblW w:type="auto" w:w="0"/>
         <w:jc w:val="center"/>
         <w:tblLayout w:type="autofit"/>
-        <w:tblLook w:firstColumn="1" w:firstRow="1" w:lastColumn="0" w:lastRow="0" w:noHBand="0" w:noVBand="1" w:val="04A0"/>
         <w:tblCellMar>
           <w:top w:w="40" w:type="dxa"/>
           <w:left w:w="70" w:type="dxa"/>
           <w:bottom w:w="40" w:type="dxa"/>
           <w:right w:w="70" w:type="dxa"/>
         </w:tblCellMar>
+        <w:tblLook w:firstColumn="1" w:firstRow="1" w:lastColumn="0" w:lastRow="0" w:noHBand="0" w:noVBand="1" w:val="04A0"/>
       </w:tblPr>
       <w:tblGrid>
         <w:gridCol w:w="4986"/>
@@ -4412,13 +4412,13 @@
         <w:tblW w:type="auto" w:w="0"/>
         <w:jc w:val="center"/>
         <w:tblLayout w:type="autofit"/>
-        <w:tblLook w:firstColumn="1" w:firstRow="1" w:lastColumn="0" w:lastRow="0" w:noHBand="0" w:noVBand="1" w:val="04A0"/>
         <w:tblCellMar>
           <w:top w:w="40" w:type="dxa"/>
           <w:left w:w="70" w:type="dxa"/>
           <w:bottom w:w="40" w:type="dxa"/>
           <w:right w:w="70" w:type="dxa"/>
         </w:tblCellMar>
+        <w:tblLook w:firstColumn="1" w:firstRow="1" w:lastColumn="0" w:lastRow="0" w:noHBand="0" w:noVBand="1" w:val="04A0"/>
       </w:tblPr>
       <w:tblGrid>
         <w:gridCol w:w="1425"/>
@@ -5272,13 +5272,13 @@
         <w:tblW w:type="auto" w:w="0"/>
         <w:jc w:val="center"/>
         <w:tblLayout w:type="autofit"/>
-        <w:tblLook w:firstColumn="1" w:firstRow="1" w:lastColumn="0" w:lastRow="0" w:noHBand="0" w:noVBand="1" w:val="04A0"/>
         <w:tblCellMar>
           <w:top w:w="40" w:type="dxa"/>
           <w:left w:w="70" w:type="dxa"/>
           <w:bottom w:w="40" w:type="dxa"/>
           <w:right w:w="70" w:type="dxa"/>
         </w:tblCellMar>
+        <w:tblLook w:firstColumn="1" w:firstRow="1" w:lastColumn="0" w:lastRow="0" w:noHBand="0" w:noVBand="1" w:val="04A0"/>
       </w:tblPr>
       <w:tblGrid>
         <w:gridCol w:w="1108"/>
@@ -5918,13 +5918,13 @@
         <w:tblW w:type="auto" w:w="0"/>
         <w:jc w:val="center"/>
         <w:tblLayout w:type="autofit"/>
-        <w:tblLook w:firstColumn="1" w:firstRow="1" w:lastColumn="0" w:lastRow="0" w:noHBand="0" w:noVBand="1" w:val="04A0"/>
         <w:tblCellMar>
           <w:top w:w="40" w:type="dxa"/>
           <w:left w:w="70" w:type="dxa"/>
           <w:bottom w:w="40" w:type="dxa"/>
           <w:right w:w="70" w:type="dxa"/>
         </w:tblCellMar>
+        <w:tblLook w:firstColumn="1" w:firstRow="1" w:lastColumn="0" w:lastRow="0" w:noHBand="0" w:noVBand="1" w:val="04A0"/>
       </w:tblPr>
       <w:tblGrid>
         <w:gridCol w:w="907"/>
@@ -8657,13 +8657,13 @@
         <w:tblW w:type="auto" w:w="0"/>
         <w:jc w:val="center"/>
         <w:tblLayout w:type="autofit"/>
-        <w:tblLook w:firstColumn="1" w:firstRow="1" w:lastColumn="0" w:lastRow="0" w:noHBand="0" w:noVBand="1" w:val="04A0"/>
         <w:tblCellMar>
           <w:top w:w="40" w:type="dxa"/>
           <w:left w:w="70" w:type="dxa"/>
           <w:bottom w:w="40" w:type="dxa"/>
           <w:right w:w="70" w:type="dxa"/>
         </w:tblCellMar>
+        <w:tblLook w:firstColumn="1" w:firstRow="1" w:lastColumn="0" w:lastRow="0" w:noHBand="0" w:noVBand="1" w:val="04A0"/>
       </w:tblPr>
       <w:tblGrid>
         <w:gridCol w:w="907"/>
@@ -9610,13 +9610,13 @@
         <w:tblW w:type="auto" w:w="0"/>
         <w:jc w:val="center"/>
         <w:tblLayout w:type="autofit"/>
-        <w:tblLook w:firstColumn="1" w:firstRow="1" w:lastColumn="0" w:lastRow="0" w:noHBand="0" w:noVBand="1" w:val="04A0"/>
         <w:tblCellMar>
           <w:top w:w="40" w:type="dxa"/>
           <w:left w:w="70" w:type="dxa"/>
           <w:bottom w:w="40" w:type="dxa"/>
           <w:right w:w="70" w:type="dxa"/>
         </w:tblCellMar>
+        <w:tblLook w:firstColumn="1" w:firstRow="1" w:lastColumn="0" w:lastRow="0" w:noHBand="0" w:noVBand="1" w:val="04A0"/>
       </w:tblPr>
       <w:tblGrid>
         <w:gridCol w:w="1662"/>
@@ -10305,13 +10305,13 @@
         <w:tblW w:type="auto" w:w="0"/>
         <w:jc w:val="center"/>
         <w:tblLayout w:type="autofit"/>
-        <w:tblLook w:firstColumn="1" w:firstRow="1" w:lastColumn="0" w:lastRow="0" w:noHBand="0" w:noVBand="1" w:val="04A0"/>
         <w:tblCellMar>
           <w:top w:w="40" w:type="dxa"/>
           <w:left w:w="70" w:type="dxa"/>
           <w:bottom w:w="40" w:type="dxa"/>
           <w:right w:w="70" w:type="dxa"/>
         </w:tblCellMar>
+        <w:tblLook w:firstColumn="1" w:firstRow="1" w:lastColumn="0" w:lastRow="0" w:noHBand="0" w:noVBand="1" w:val="04A0"/>
       </w:tblPr>
       <w:tblGrid>
         <w:gridCol w:w="4986"/>
@@ -10872,13 +10872,13 @@
         <w:tblW w:type="auto" w:w="0"/>
         <w:jc w:val="center"/>
         <w:tblLayout w:type="autofit"/>
-        <w:tblLook w:firstColumn="1" w:firstRow="1" w:lastColumn="0" w:lastRow="0" w:noHBand="0" w:noVBand="1" w:val="04A0"/>
         <w:tblCellMar>
           <w:top w:w="40" w:type="dxa"/>
           <w:left w:w="70" w:type="dxa"/>
           <w:bottom w:w="40" w:type="dxa"/>
           <w:right w:w="70" w:type="dxa"/>
         </w:tblCellMar>
+        <w:tblLook w:firstColumn="1" w:firstRow="1" w:lastColumn="0" w:lastRow="0" w:noHBand="0" w:noVBand="1" w:val="04A0"/>
       </w:tblPr>
       <w:tblGrid>
         <w:gridCol w:w="4986"/>
@@ -11293,13 +11293,13 @@
         <w:tblW w:type="auto" w:w="0"/>
         <w:jc w:val="center"/>
         <w:tblLayout w:type="autofit"/>
-        <w:tblLook w:firstColumn="1" w:firstRow="1" w:lastColumn="0" w:lastRow="0" w:noHBand="0" w:noVBand="1" w:val="04A0"/>
         <w:tblCellMar>
           <w:top w:w="40" w:type="dxa"/>
           <w:left w:w="70" w:type="dxa"/>
           <w:bottom w:w="40" w:type="dxa"/>
           <w:right w:w="70" w:type="dxa"/>
         </w:tblCellMar>
+        <w:tblLook w:firstColumn="1" w:firstRow="1" w:lastColumn="0" w:lastRow="0" w:noHBand="0" w:noVBand="1" w:val="04A0"/>
       </w:tblPr>
       <w:tblGrid>
         <w:gridCol w:w="3324"/>

</xml_diff>